<commit_message>
Cập nhật báo cáo hoàn thiện và báo cáo Tuần 02
</commit_message>
<xml_diff>
--- a/report/bao_cao_tieu_luan_hoan_thien.docx
+++ b/report/bao_cao_tieu_luan_hoan_thien.docx
@@ -2315,26 +2315,22 @@
         <w:jc w:val="center"/>
       </w:pPr>
       <w:r>
-        <w:rPr>
-          <w:noProof/>
-        </w:rPr>
         <w:drawing>
-          <wp:inline distT="0" distB="0" distL="0" distR="0" wp14:anchorId="3927BEB4" wp14:editId="44CBE25F">
-            <wp:extent cx="3600000" cy="3970588"/>
-            <wp:effectExtent l="0" t="0" r="0" b="0"/>
-            <wp:docPr id="1" name="Picture 1" descr="Sơ đồ thiết bị kiểm tra chữ ký số, phiên bản và ghi vào phân vùng dự phòng"/>
+          <wp:inline xmlns:a="http://schemas.openxmlformats.org/drawingml/2006/main" xmlns:pic="http://schemas.openxmlformats.org/drawingml/2006/picture">
+            <wp:extent cx="5806440" cy="3629025"/>
+            <wp:docPr id="4" name="Picture 4"/>
             <wp:cNvGraphicFramePr>
-              <a:graphicFrameLocks xmlns:a="http://schemas.openxmlformats.org/drawingml/2006/main" noChangeAspect="1"/>
+              <a:graphicFrameLocks noChangeAspect="1"/>
             </wp:cNvGraphicFramePr>
-            <a:graphic xmlns:a="http://schemas.openxmlformats.org/drawingml/2006/main">
+            <a:graphic>
               <a:graphicData uri="http://schemas.openxmlformats.org/drawingml/2006/picture">
-                <pic:pic xmlns:pic="http://schemas.openxmlformats.org/drawingml/2006/picture">
+                <pic:pic>
                   <pic:nvPicPr>
-                    <pic:cNvPr id="0" name="so_do_luong_bao_ve.png"/>
+                    <pic:cNvPr id="0" name="so_do_ota_an_toan.png"/>
                     <pic:cNvPicPr/>
                   </pic:nvPicPr>
                   <pic:blipFill>
-                    <a:blip r:embed="rId8"/>
+                    <a:blip r:embed="rId15"/>
                     <a:stretch>
                       <a:fillRect/>
                     </a:stretch>
@@ -2342,11 +2338,9 @@
                   <pic:spPr>
                     <a:xfrm>
                       <a:off x="0" y="0"/>
-                      <a:ext cx="3600000" cy="3970588"/>
+                      <a:ext cx="5806440" cy="3629025"/>
                     </a:xfrm>
-                    <a:prstGeom prst="rect">
-                      <a:avLst/>
-                    </a:prstGeom>
+                    <a:prstGeom prst="rect"/>
                   </pic:spPr>
                 </pic:pic>
               </a:graphicData>
@@ -2366,7 +2360,7 @@
           <w:i/>
           <w:sz w:val="20"/>
         </w:rPr>
-        <w:t>Hình 2.1. Luồng xác minh và chống rollback trên thiết bị (nguồn: tác giả)</w:t>
+        <w:t>Hình 2.1. Quy trình OTA an toàn: xác minh trước khi cài đặt (nguồn: tác giả)</w:t>
       </w:r>
     </w:p>
     <w:p>
@@ -3419,131 +3413,53 @@
         </w:tc>
       </w:tr>
       <w:tr>
-        <w:trPr>
-          <w:jc w:val="center"/>
-        </w:trPr>
-        <w:tc>
-          <w:tcPr>
-            <w:tcW w:w="1984" w:type="dxa"/>
-            <w:shd w:val="clear" w:color="auto" w:fill="F2F2F2"/>
-            <w:tcMar>
-              <w:top w:w="90" w:type="dxa"/>
-              <w:left w:w="110" w:type="dxa"/>
-              <w:bottom w:w="90" w:type="dxa"/>
-              <w:right w:w="110" w:type="dxa"/>
-            </w:tcMar>
-            <w:vAlign w:val="center"/>
-          </w:tcPr>
-          <w:p>
-            <w:pPr>
-              <w:spacing w:after="0" w:line="240" w:lineRule="auto"/>
-            </w:pPr>
-            <w:r>
-              <w:rPr>
-                <w:rFonts w:eastAsia="Times New Roman"/>
-                <w:sz w:val="17"/>
-              </w:rPr>
-              <w:t>tampered_ciphertext</w:t>
-            </w:r>
-          </w:p>
-        </w:tc>
-        <w:tc>
-          <w:tcPr>
-            <w:tcW w:w="1134" w:type="dxa"/>
-            <w:shd w:val="clear" w:color="auto" w:fill="F2F2F2"/>
-            <w:tcMar>
-              <w:top w:w="90" w:type="dxa"/>
-              <w:left w:w="110" w:type="dxa"/>
-              <w:bottom w:w="90" w:type="dxa"/>
-              <w:right w:w="110" w:type="dxa"/>
-            </w:tcMar>
-            <w:vAlign w:val="center"/>
-          </w:tcPr>
-          <w:p>
-            <w:pPr>
-              <w:spacing w:after="0" w:line="240" w:lineRule="auto"/>
-            </w:pPr>
-            <w:r>
-              <w:rPr>
-                <w:rFonts w:eastAsia="Times New Roman"/>
-                <w:sz w:val="17"/>
-              </w:rPr>
+        <w:tc>
+          <w:tcPr>
+            <w:tcW w:type="dxa" w:w="1984"/>
+          </w:tcPr>
+          <w:p>
+            <w:r>
+              <w:t>tampered_manifest_signature</w:t>
+            </w:r>
+          </w:p>
+        </w:tc>
+        <w:tc>
+          <w:tcPr>
+            <w:tcW w:type="dxa" w:w="1134"/>
+          </w:tcPr>
+          <w:p>
+            <w:r>
               <w:t>REJECT</w:t>
             </w:r>
           </w:p>
         </w:tc>
         <w:tc>
           <w:tcPr>
-            <w:tcW w:w="1134" w:type="dxa"/>
-            <w:shd w:val="clear" w:color="auto" w:fill="F2F2F2"/>
-            <w:tcMar>
-              <w:top w:w="90" w:type="dxa"/>
-              <w:left w:w="110" w:type="dxa"/>
-              <w:bottom w:w="90" w:type="dxa"/>
-              <w:right w:w="110" w:type="dxa"/>
-            </w:tcMar>
-            <w:vAlign w:val="center"/>
-          </w:tcPr>
-          <w:p>
-            <w:pPr>
-              <w:spacing w:after="0" w:line="240" w:lineRule="auto"/>
-            </w:pPr>
-            <w:r>
-              <w:rPr>
-                <w:rFonts w:eastAsia="Times New Roman"/>
-                <w:sz w:val="17"/>
-              </w:rPr>
+            <w:tcW w:type="dxa" w:w="1134"/>
+          </w:tcPr>
+          <w:p>
+            <w:r>
               <w:t>REJECT</w:t>
             </w:r>
           </w:p>
         </w:tc>
         <w:tc>
           <w:tcPr>
-            <w:tcW w:w="794" w:type="dxa"/>
-            <w:shd w:val="clear" w:color="auto" w:fill="F2F2F2"/>
-            <w:tcMar>
-              <w:top w:w="90" w:type="dxa"/>
-              <w:left w:w="110" w:type="dxa"/>
-              <w:bottom w:w="90" w:type="dxa"/>
-              <w:right w:w="110" w:type="dxa"/>
-            </w:tcMar>
-            <w:vAlign w:val="center"/>
-          </w:tcPr>
-          <w:p>
-            <w:pPr>
-              <w:spacing w:after="0" w:line="240" w:lineRule="auto"/>
-            </w:pPr>
-            <w:r>
-              <w:rPr>
-                <w:rFonts w:eastAsia="Times New Roman"/>
-                <w:sz w:val="17"/>
-              </w:rPr>
+            <w:tcW w:type="dxa" w:w="794"/>
+          </w:tcPr>
+          <w:p>
+            <w:r>
               <w:t>PASS</w:t>
             </w:r>
           </w:p>
         </w:tc>
         <w:tc>
           <w:tcPr>
-            <w:tcW w:w="3288" w:type="dxa"/>
-            <w:shd w:val="clear" w:color="auto" w:fill="F2F2F2"/>
-            <w:tcMar>
-              <w:top w:w="90" w:type="dxa"/>
-              <w:left w:w="110" w:type="dxa"/>
-              <w:bottom w:w="90" w:type="dxa"/>
-              <w:right w:w="110" w:type="dxa"/>
-            </w:tcMar>
-            <w:vAlign w:val="center"/>
-          </w:tcPr>
-          <w:p>
-            <w:pPr>
-              <w:spacing w:after="0" w:line="240" w:lineRule="auto"/>
-            </w:pPr>
-            <w:r>
-              <w:rPr>
-                <w:rFonts w:eastAsia="Times New Roman"/>
-                <w:sz w:val="17"/>
-              </w:rPr>
-              <w:t>Giải mã/xác thực AES-GCM thất bại</w:t>
+            <w:tcW w:type="dxa" w:w="3288"/>
+          </w:tcPr>
+          <w:p>
+            <w:r>
+              <w:t>Chữ ký manifest không hợp lệ</w:t>
             </w:r>
           </w:p>
         </w:tc>
@@ -3555,6 +3471,7 @@
         <w:tc>
           <w:tcPr>
             <w:tcW w:w="1984" w:type="dxa"/>
+            <w:shd w:val="clear" w:color="auto" w:fill="F2F2F2"/>
             <w:tcMar>
               <w:top w:w="90" w:type="dxa"/>
               <w:left w:w="110" w:type="dxa"/>
@@ -3572,13 +3489,14 @@
                 <w:rFonts w:eastAsia="Times New Roman"/>
                 <w:sz w:val="17"/>
               </w:rPr>
-              <w:t>rollback_sequence</w:t>
+              <w:t>tampered_ciphertext</w:t>
             </w:r>
           </w:p>
         </w:tc>
         <w:tc>
           <w:tcPr>
             <w:tcW w:w="1134" w:type="dxa"/>
+            <w:shd w:val="clear" w:color="auto" w:fill="F2F2F2"/>
             <w:tcMar>
               <w:top w:w="90" w:type="dxa"/>
               <w:left w:w="110" w:type="dxa"/>
@@ -3603,6 +3521,7 @@
         <w:tc>
           <w:tcPr>
             <w:tcW w:w="1134" w:type="dxa"/>
+            <w:shd w:val="clear" w:color="auto" w:fill="F2F2F2"/>
             <w:tcMar>
               <w:top w:w="90" w:type="dxa"/>
               <w:left w:w="110" w:type="dxa"/>
@@ -3627,6 +3546,7 @@
         <w:tc>
           <w:tcPr>
             <w:tcW w:w="794" w:type="dxa"/>
+            <w:shd w:val="clear" w:color="auto" w:fill="F2F2F2"/>
             <w:tcMar>
               <w:top w:w="90" w:type="dxa"/>
               <w:left w:w="110" w:type="dxa"/>
@@ -3651,6 +3571,7 @@
         <w:tc>
           <w:tcPr>
             <w:tcW w:w="3288" w:type="dxa"/>
+            <w:shd w:val="clear" w:color="auto" w:fill="F2F2F2"/>
             <w:tcMar>
               <w:top w:w="90" w:type="dxa"/>
               <w:left w:w="110" w:type="dxa"/>
@@ -3668,7 +3589,7 @@
                 <w:rFonts w:eastAsia="Times New Roman"/>
                 <w:sz w:val="17"/>
               </w:rPr>
-              <w:t>Chống rollback: sequence 1 &lt;= 1</w:t>
+              <w:t>Giải mã/xác thực AES-GCM thất bại</w:t>
             </w:r>
           </w:p>
         </w:tc>
@@ -3680,6 +3601,131 @@
         <w:tc>
           <w:tcPr>
             <w:tcW w:w="1984" w:type="dxa"/>
+            <w:tcMar>
+              <w:top w:w="90" w:type="dxa"/>
+              <w:left w:w="110" w:type="dxa"/>
+              <w:bottom w:w="90" w:type="dxa"/>
+              <w:right w:w="110" w:type="dxa"/>
+            </w:tcMar>
+            <w:vAlign w:val="center"/>
+          </w:tcPr>
+          <w:p>
+            <w:pPr>
+              <w:spacing w:after="0" w:line="240" w:lineRule="auto"/>
+            </w:pPr>
+            <w:r>
+              <w:rPr>
+                <w:rFonts w:eastAsia="Times New Roman"/>
+                <w:sz w:val="17"/>
+              </w:rPr>
+              <w:t>rollback_sequence</w:t>
+            </w:r>
+          </w:p>
+        </w:tc>
+        <w:tc>
+          <w:tcPr>
+            <w:tcW w:w="1134" w:type="dxa"/>
+            <w:tcMar>
+              <w:top w:w="90" w:type="dxa"/>
+              <w:left w:w="110" w:type="dxa"/>
+              <w:bottom w:w="90" w:type="dxa"/>
+              <w:right w:w="110" w:type="dxa"/>
+            </w:tcMar>
+            <w:vAlign w:val="center"/>
+          </w:tcPr>
+          <w:p>
+            <w:pPr>
+              <w:spacing w:after="0" w:line="240" w:lineRule="auto"/>
+            </w:pPr>
+            <w:r>
+              <w:rPr>
+                <w:rFonts w:eastAsia="Times New Roman"/>
+                <w:sz w:val="17"/>
+              </w:rPr>
+              <w:t>REJECT</w:t>
+            </w:r>
+          </w:p>
+        </w:tc>
+        <w:tc>
+          <w:tcPr>
+            <w:tcW w:w="1134" w:type="dxa"/>
+            <w:tcMar>
+              <w:top w:w="90" w:type="dxa"/>
+              <w:left w:w="110" w:type="dxa"/>
+              <w:bottom w:w="90" w:type="dxa"/>
+              <w:right w:w="110" w:type="dxa"/>
+            </w:tcMar>
+            <w:vAlign w:val="center"/>
+          </w:tcPr>
+          <w:p>
+            <w:pPr>
+              <w:spacing w:after="0" w:line="240" w:lineRule="auto"/>
+            </w:pPr>
+            <w:r>
+              <w:rPr>
+                <w:rFonts w:eastAsia="Times New Roman"/>
+                <w:sz w:val="17"/>
+              </w:rPr>
+              <w:t>REJECT</w:t>
+            </w:r>
+          </w:p>
+        </w:tc>
+        <w:tc>
+          <w:tcPr>
+            <w:tcW w:w="794" w:type="dxa"/>
+            <w:tcMar>
+              <w:top w:w="90" w:type="dxa"/>
+              <w:left w:w="110" w:type="dxa"/>
+              <w:bottom w:w="90" w:type="dxa"/>
+              <w:right w:w="110" w:type="dxa"/>
+            </w:tcMar>
+            <w:vAlign w:val="center"/>
+          </w:tcPr>
+          <w:p>
+            <w:pPr>
+              <w:spacing w:after="0" w:line="240" w:lineRule="auto"/>
+            </w:pPr>
+            <w:r>
+              <w:rPr>
+                <w:rFonts w:eastAsia="Times New Roman"/>
+                <w:sz w:val="17"/>
+              </w:rPr>
+              <w:t>PASS</w:t>
+            </w:r>
+          </w:p>
+        </w:tc>
+        <w:tc>
+          <w:tcPr>
+            <w:tcW w:w="3288" w:type="dxa"/>
+            <w:tcMar>
+              <w:top w:w="90" w:type="dxa"/>
+              <w:left w:w="110" w:type="dxa"/>
+              <w:bottom w:w="90" w:type="dxa"/>
+              <w:right w:w="110" w:type="dxa"/>
+            </w:tcMar>
+            <w:vAlign w:val="center"/>
+          </w:tcPr>
+          <w:p>
+            <w:pPr>
+              <w:spacing w:after="0" w:line="240" w:lineRule="auto"/>
+            </w:pPr>
+            <w:r>
+              <w:rPr>
+                <w:rFonts w:eastAsia="Times New Roman"/>
+                <w:sz w:val="17"/>
+              </w:rPr>
+              <w:t>Chống rollback: sequence 1 &lt;= 1</w:t>
+            </w:r>
+          </w:p>
+        </w:tc>
+      </w:tr>
+      <w:tr>
+        <w:trPr>
+          <w:jc w:val="center"/>
+        </w:trPr>
+        <w:tc>
+          <w:tcPr>
+            <w:tcW w:w="1984" w:type="dxa"/>
             <w:shd w:val="clear" w:color="auto" w:fill="F2F2F2"/>
             <w:tcMar>
               <w:top w:w="90" w:type="dxa"/>
@@ -3818,7 +3864,7 @@
         <w:rPr>
           <w:rFonts w:eastAsia="Times New Roman"/>
         </w:rPr>
-        <w:t>Kết quả 4/4 ca đạt kỳ vọng. Trường hợp sửa một bit bị AES-GCM từ chối; bản sequence cũ bị chặn trước giải mã; bản mới lỗi self-test không được commit. Ca hợp lệ được cài và trạng thái thiết bị chuyển sang version 2.0.0, sequence 2.</w:t>
+        <w:t>Kết quả 5/5 ca đạt kỳ vọng. Chữ ký manifest bị sửa được RSA-PSS từ chối; trường hợp sửa một bit bị AES-GCM từ chối; bản sequence cũ bị chặn trước giải mã; bản mới lỗi self-test không được commit. Ca hợp lệ được cài và trạng thái thiết bị chuyển sang version 2.0.0, sequence 2.</w:t>
       </w:r>
     </w:p>
     <w:p>
@@ -3836,187 +3882,22 @@
       </w:r>
     </w:p>
     <w:p>
-      <w:pPr>
-        <w:ind w:left="283" w:right="283"/>
-      </w:pPr>
       <w:r>
         <w:rPr>
-          <w:rFonts w:ascii="Consolas" w:eastAsia="Consolas" w:hAnsi="Consolas"/>
+          <w:rFonts w:ascii="Consolas" w:hAnsi="Consolas"/>
           <w:sz w:val="16"/>
         </w:rPr>
-        <w:t>CASE=valid_signed_update EXPECTED=ACCEPT ACTUAL=ACCEPT RESULT=PASS DETAIL=Đã cài phiên b</w:t>
-      </w:r>
-      <w:r>
-        <w:rPr>
-          <w:rFonts w:ascii="Consolas" w:eastAsia="Consolas" w:hAnsi="Consolas"/>
-          <w:sz w:val="16"/>
-        </w:rPr>
-        <w:t>ả</w:t>
-      </w:r>
-      <w:r>
-        <w:rPr>
-          <w:rFonts w:ascii="Consolas" w:eastAsia="Consolas" w:hAnsi="Consolas"/>
-          <w:sz w:val="16"/>
-        </w:rPr>
-        <w:t>n 2.0.0 (sequence 2)</w:t>
-      </w:r>
-      <w:r>
-        <w:rPr>
-          <w:rFonts w:ascii="Consolas" w:eastAsia="Consolas" w:hAnsi="Consolas"/>
-          <w:sz w:val="16"/>
-        </w:rPr>
+        <w:t>CASE=valid_signed_update EXPECTED=ACCEPT ACTUAL=ACCEPT RESULT=PASS DETAIL=Đã cài phiên bản 2.0.0 (sequence 2)</w:t>
         <w:br/>
-        <w:t>CASE=tampered_ciphertext EXPECTED=REJECT ACTUAL=REJECT RESULT=PASS DETAIL=Gi</w:t>
-      </w:r>
-      <w:r>
-        <w:rPr>
-          <w:rFonts w:ascii="Consolas" w:eastAsia="Consolas" w:hAnsi="Consolas"/>
-          <w:sz w:val="16"/>
-        </w:rPr>
-        <w:t>ả</w:t>
-      </w:r>
-      <w:r>
-        <w:rPr>
-          <w:rFonts w:ascii="Consolas" w:eastAsia="Consolas" w:hAnsi="Consolas"/>
-          <w:sz w:val="16"/>
-        </w:rPr>
-        <w:t>i mã/xác th</w:t>
-      </w:r>
-      <w:r>
-        <w:rPr>
-          <w:rFonts w:ascii="Consolas" w:eastAsia="Consolas" w:hAnsi="Consolas"/>
-          <w:sz w:val="16"/>
-        </w:rPr>
-        <w:t>ự</w:t>
-      </w:r>
-      <w:r>
-        <w:rPr>
-          <w:rFonts w:ascii="Consolas" w:eastAsia="Consolas" w:hAnsi="Consolas"/>
-          <w:sz w:val="16"/>
-        </w:rPr>
-        <w:t>c AES-GCM th</w:t>
-      </w:r>
-      <w:r>
-        <w:rPr>
-          <w:rFonts w:ascii="Consolas" w:eastAsia="Consolas" w:hAnsi="Consolas"/>
-          <w:sz w:val="16"/>
-        </w:rPr>
-        <w:t>ấ</w:t>
-      </w:r>
-      <w:r>
-        <w:rPr>
-          <w:rFonts w:ascii="Consolas" w:eastAsia="Consolas" w:hAnsi="Consolas"/>
-          <w:sz w:val="16"/>
-        </w:rPr>
-        <w:t>t b</w:t>
-      </w:r>
-      <w:r>
-        <w:rPr>
-          <w:rFonts w:ascii="Consolas" w:eastAsia="Consolas" w:hAnsi="Consolas"/>
-          <w:sz w:val="16"/>
-        </w:rPr>
-        <w:t>ạ</w:t>
-      </w:r>
-      <w:r>
-        <w:rPr>
-          <w:rFonts w:ascii="Consolas" w:eastAsia="Consolas" w:hAnsi="Consolas"/>
-          <w:sz w:val="16"/>
-        </w:rPr>
-        <w:t>i</w:t>
-      </w:r>
-      <w:r>
-        <w:rPr>
-          <w:rFonts w:ascii="Consolas" w:eastAsia="Consolas" w:hAnsi="Consolas"/>
-          <w:sz w:val="16"/>
-        </w:rPr>
+        <w:t>CASE=tampered_manifest_signature EXPECTED=REJECT ACTUAL=REJECT RESULT=PASS DETAIL=Chữ ký manifest không hợp lệ</w:t>
         <w:br/>
-        <w:t>CASE=rollback_sequence EXPECTED=REJECT ACTUAL=REJECT RESULT=PASS DETAIL=Ch</w:t>
-      </w:r>
-      <w:r>
-        <w:rPr>
-          <w:rFonts w:ascii="Consolas" w:eastAsia="Consolas" w:hAnsi="Consolas"/>
-          <w:sz w:val="16"/>
-        </w:rPr>
-        <w:t>ố</w:t>
-      </w:r>
-      <w:r>
-        <w:rPr>
-          <w:rFonts w:ascii="Consolas" w:eastAsia="Consolas" w:hAnsi="Consolas"/>
-          <w:sz w:val="16"/>
-        </w:rPr>
-        <w:t>ng rollback: sequence 1 &lt;= 1</w:t>
-      </w:r>
-      <w:r>
-        <w:rPr>
-          <w:rFonts w:ascii="Consolas" w:eastAsia="Consolas" w:hAnsi="Consolas"/>
-          <w:sz w:val="16"/>
-        </w:rPr>
+        <w:t>CASE=tampered_ciphertext EXPECTED=REJECT ACTUAL=REJECT RESULT=PASS DETAIL=Giải mã/xác thực AES-GCM thất bại</w:t>
         <w:br/>
-        <w:t>CASE=failed_self_test EXPECTED=REJECT ACTUAL=REJECT RESULT=PASS DETAIL=Self-test th</w:t>
-      </w:r>
-      <w:r>
-        <w:rPr>
-          <w:rFonts w:ascii="Consolas" w:eastAsia="Consolas" w:hAnsi="Consolas"/>
-          <w:sz w:val="16"/>
-        </w:rPr>
-        <w:t>ấ</w:t>
-      </w:r>
-      <w:r>
-        <w:rPr>
-          <w:rFonts w:ascii="Consolas" w:eastAsia="Consolas" w:hAnsi="Consolas"/>
-          <w:sz w:val="16"/>
-        </w:rPr>
-        <w:t>t b</w:t>
-      </w:r>
-      <w:r>
-        <w:rPr>
-          <w:rFonts w:ascii="Consolas" w:eastAsia="Consolas" w:hAnsi="Consolas"/>
-          <w:sz w:val="16"/>
-        </w:rPr>
-        <w:t>ạ</w:t>
-      </w:r>
-      <w:r>
-        <w:rPr>
-          <w:rFonts w:ascii="Consolas" w:eastAsia="Consolas" w:hAnsi="Consolas"/>
-          <w:sz w:val="16"/>
-        </w:rPr>
-        <w:t>i; đã rollback v</w:t>
-      </w:r>
-      <w:r>
-        <w:rPr>
-          <w:rFonts w:ascii="Consolas" w:eastAsia="Consolas" w:hAnsi="Consolas"/>
-          <w:sz w:val="16"/>
-        </w:rPr>
-        <w:t>ề</w:t>
-      </w:r>
-      <w:r>
-        <w:rPr>
-          <w:rFonts w:ascii="Consolas" w:eastAsia="Consolas" w:hAnsi="Consolas"/>
-          <w:sz w:val="16"/>
-        </w:rPr>
-        <w:t xml:space="preserve"> firmware trư</w:t>
-      </w:r>
-      <w:r>
-        <w:rPr>
-          <w:rFonts w:ascii="Consolas" w:eastAsia="Consolas" w:hAnsi="Consolas"/>
-          <w:sz w:val="16"/>
-        </w:rPr>
-        <w:t>ớ</w:t>
-      </w:r>
-      <w:r>
-        <w:rPr>
-          <w:rFonts w:ascii="Consolas" w:eastAsia="Consolas" w:hAnsi="Consolas"/>
-          <w:sz w:val="16"/>
-        </w:rPr>
-        <w:t>c</w:t>
-      </w:r>
-      <w:r>
-        <w:rPr>
-          <w:rFonts w:ascii="Consolas" w:eastAsia="Consolas" w:hAnsi="Consolas"/>
-          <w:sz w:val="16"/>
-        </w:rPr>
+        <w:t>CASE=rollback_sequence EXPECTED=REJECT ACTUAL=REJECT RESULT=PASS DETAIL=Chống rollback: sequence 1 &lt;= 1</w:t>
         <w:br/>
-        <w:t>SUMMARY total=4 pass=4 fail=0</w:t>
+        <w:t>CASE=failed_self_test EXPECTED=REJECT ACTUAL=REJECT RESULT=PASS DETAIL=Self-test thất bại; đã rollback về firmware trước</w:t>
+        <w:br/>
+        <w:t>SUMMARY total=5 pass=5 fail=0</w:t>
       </w:r>
     </w:p>
     <w:p>
@@ -4066,7 +3947,7 @@
         <w:rPr>
           <w:rFonts w:eastAsia="Times New Roman"/>
         </w:rPr>
-        <w:t>Minh chứng 3: `results/manifest_v2.json` và các sơ đồ - cấu hình/flow có thể kiểm tra.</w:t>
+        <w:t>Minh chứng 3: `results/manifest_v2.json`, `results/signed_manifest_v2.json` và các sơ đồ - cấu hình/flow có thể kiểm tra.</w:t>
       </w:r>
     </w:p>
     <w:p>
@@ -6886,7 +6767,7 @@
         <w:rPr>
           <w:rFonts w:eastAsia="Times New Roman"/>
         </w:rPr>
-        <w:t>Đề tài đã xây dựng được một quy trình cập nhật firmware an toàn ở mức mô phỏng, đáp ứng các mục tiêu bắt buộc: có firmware v1/v2 giả lập, manifest và SHA-256, chữ ký số, mã hóa/xác thực payload, chống rollback, rollback sau self-test, sơ đồ luồng, log và bảng kết quả. Bốn ca kiểm thử đều đạt kỳ vọng. Kết quả cho thấy hash đơn lẻ hoặc HTTPS đơn lẻ là chưa đủ; quyết định cài đặt cần dựa trên manifest được ký, chính sách phiên bản và cơ chế phục hồi.</w:t>
+        <w:t>Đề tài đã xây dựng được một quy trình cập nhật firmware an toàn ở mức mô phỏng, đáp ứng các mục tiêu bắt buộc: có firmware v1/v2 giả lập, manifest và SHA-256, chữ ký số, mã hóa/xác thực payload, chống rollback, rollback sau self-test, sơ đồ luồng, log và bảng kết quả. Năm ca kiểm thử đều đạt kỳ vọng. Kết quả cho thấy hash đơn lẻ hoặc HTTPS đơn lẻ là chưa đủ; quyết định cài đặt cần dựa trên manifest được ký, chính sách phiên bản và cơ chế phục hồi.</w:t>
       </w:r>
     </w:p>
     <w:p>
@@ -7519,94 +7400,28 @@
     <w:p>
       <w:r>
         <w:rPr>
-          <w:rFonts w:ascii="Consolas" w:eastAsia="Consolas" w:hAnsi="Consolas"/>
-          <w:sz w:val="18"/>
+          <w:rFonts w:ascii="Consolas" w:hAnsi="Consolas"/>
+          <w:sz w:val="17"/>
         </w:rPr>
         <w:t>n20-secure-firmware-update-iot/</w:t>
-      </w:r>
-      <w:r>
-        <w:rPr>
-          <w:rFonts w:ascii="Consolas" w:eastAsia="Consolas" w:hAnsi="Consolas"/>
-          <w:sz w:val="18"/>
-        </w:rPr>
         <w:br/>
         <w:t>├── README.md</w:t>
-      </w:r>
-      <w:r>
-        <w:rPr>
-          <w:rFonts w:ascii="Consolas" w:eastAsia="Consolas" w:hAnsi="Consolas"/>
-          <w:sz w:val="18"/>
-        </w:rPr>
         <w:br/>
         <w:t>├── configs/security_policy.json</w:t>
-      </w:r>
-      <w:r>
-        <w:rPr>
-          <w:rFonts w:ascii="Consolas" w:eastAsia="Consolas" w:hAnsi="Consolas"/>
-          <w:sz w:val="18"/>
-        </w:rPr>
         <w:br/>
         <w:t>├── data/firmware_v1.bin, firmware_v2.bin, firmware_v3_bad.bin</w:t>
-      </w:r>
-      <w:r>
-        <w:rPr>
-          <w:rFonts w:ascii="Consolas" w:eastAsia="Consolas" w:hAnsi="Consolas"/>
-          <w:sz w:val="18"/>
-        </w:rPr>
         <w:br/>
-        <w:t>├── references/link_nguon.txt</w:t>
-      </w:r>
-      <w:r>
-        <w:rPr>
-          <w:rFonts w:ascii="Consolas" w:eastAsia="Consolas" w:hAnsi="Consolas"/>
-          <w:sz w:val="18"/>
-        </w:rPr>
+        <w:t>├── references/link_nguon.md</w:t>
         <w:br/>
         <w:t>├── report/bao_cao_tieu_luan_hoan_thien.docx</w:t>
-      </w:r>
-      <w:r>
-        <w:rPr>
-          <w:rFonts w:ascii="Consolas" w:eastAsia="Consolas" w:hAnsi="Consolas"/>
-          <w:sz w:val="18"/>
-        </w:rPr>
         <w:br/>
-      </w:r>
-      <w:r>
-        <w:rPr>
-          <w:rFonts w:ascii="Consolas" w:eastAsia="Consolas" w:hAnsi="Consolas"/>
-          <w:sz w:val="18"/>
-        </w:rPr>
-        <w:t>├── results/manifest_v2.json, test_matrix.csv</w:t>
-      </w:r>
-      <w:r>
-        <w:rPr>
-          <w:rFonts w:ascii="Consolas" w:eastAsia="Consolas" w:hAnsi="Consolas"/>
-          <w:sz w:val="18"/>
-        </w:rPr>
+        <w:t>├── results/manifest_v2.json, signed_manifest_v2.json, test_matrix.csv</w:t>
         <w:br/>
         <w:t>├── results/logs/secure_update_demo.log</w:t>
-      </w:r>
-      <w:r>
-        <w:rPr>
-          <w:rFonts w:ascii="Consolas" w:eastAsia="Consolas" w:hAnsi="Consolas"/>
-          <w:sz w:val="18"/>
-        </w:rPr>
         <w:br/>
-        <w:t>├── slides/slide_trinh_bay.pptx</w:t>
-      </w:r>
-      <w:r>
-        <w:rPr>
-          <w:rFonts w:ascii="Consolas" w:eastAsia="Consolas" w:hAnsi="Consolas"/>
-          <w:sz w:val="18"/>
-        </w:rPr>
+        <w:t>├── slides/slide_trinh_bay_hoan_thien.pptx</w:t>
         <w:br/>
         <w:t>├── src/code_demo.py</w:t>
-      </w:r>
-      <w:r>
-        <w:rPr>
-          <w:rFonts w:ascii="Consolas" w:eastAsia="Consolas" w:hAnsi="Consolas"/>
-          <w:sz w:val="18"/>
-        </w:rPr>
         <w:br/>
         <w:t>└── update_so_do_hinh_anh/</w:t>
       </w:r>
@@ -7701,7 +7516,7 @@
         <w:rPr>
           <w:rFonts w:eastAsia="Times New Roman"/>
         </w:rPr>
-        <w:t>`results/manifest_v2.json`: target, version, sequence, size, SHA-256 và thuật toán.</w:t>
+        <w:t>`results/manifest_v2.json` và `results/signed_manifest_v2.json`: target, version, sequence, size, SHA-256 và thuật toán.</w:t>
       </w:r>
     </w:p>
     <w:p>

</xml_diff>